<commit_message>
Mais sinonimos na busca, cartao de compartilhamento e teste novo (28 testes)
Co-Authored-By: Claude Sonnet 5.5 <noreply@anthropic.com>
</commit_message>
<xml_diff>
--- a/docs/apresentacao/colinha-de-apresentacao.docx
+++ b/docs/apresentacao/colinha-de-apresentacao.docx
@@ -1538,7 +1538,7 @@
           <w:sz w:val="26"/>
           <w:szCs w:val="26"/>
         </w:rPr>
-        <w:t xml:space="preserve">27 fotos livres · 27 testes automáticos</w:t>
+        <w:t xml:space="preserve">27 fotos livres · 28 testes automáticos</w:t>
       </w:r>
     </w:p>
     <w:p>
@@ -1608,7 +1608,7 @@
           <w:sz w:val="26"/>
           <w:szCs w:val="26"/>
         </w:rPr>
-        <w:t xml:space="preserve">Push no GitHub → 27 testes → site no ar (https)</w:t>
+        <w:t xml:space="preserve">Push no GitHub → 28 testes → site no ar (https)</w:t>
       </w:r>
     </w:p>
     <w:p>

</xml_diff>

<commit_message>
Mais 10 lugares na base (42 no total), 4 fotos novas com credito e textos atualizados
Co-Authored-By: Claude Sonnet 5.5 <noreply@anthropic.com>
</commit_message>
<xml_diff>
--- a/docs/apresentacao/colinha-de-apresentacao.docx
+++ b/docs/apresentacao/colinha-de-apresentacao.docx
@@ -582,7 +582,7 @@
           <w:sz w:val="26"/>
           <w:szCs w:val="26"/>
         </w:rPr>
-        <w:t xml:space="preserve">Interface (Leaflet) · Lógica (testável) · Dados (32 lugares)</w:t>
+        <w:t xml:space="preserve">Interface (Leaflet) · Lógica (testável) · Dados (42 lugares)</w:t>
       </w:r>
     </w:p>
     <w:p>
@@ -1538,7 +1538,7 @@
           <w:sz w:val="26"/>
           <w:szCs w:val="26"/>
         </w:rPr>
-        <w:t xml:space="preserve">27 fotos livres · 28 testes automáticos</w:t>
+        <w:t xml:space="preserve">31 fotos livres · 28 testes automáticos</w:t>
       </w:r>
     </w:p>
     <w:p>
@@ -1750,7 +1750,7 @@
           <w:sz w:val="26"/>
           <w:szCs w:val="26"/>
         </w:rPr>
-        <w:t xml:space="preserve">5 lugares sem foto · testar em mais celulares</w:t>
+        <w:t xml:space="preserve">11 lugares sem foto · testar em mais celulares</w:t>
       </w:r>
     </w:p>
     <w:p>

</xml_diff>

<commit_message>
Base com 65 lugares (museus, teatros, igrejas, pracas), 47 fotos com credito e novo roteiro de museus
Co-Authored-By: Claude Sonnet 5.5 <noreply@anthropic.com>
</commit_message>
<xml_diff>
--- a/docs/apresentacao/colinha-de-apresentacao.docx
+++ b/docs/apresentacao/colinha-de-apresentacao.docx
@@ -582,7 +582,7 @@
           <w:sz w:val="26"/>
           <w:szCs w:val="26"/>
         </w:rPr>
-        <w:t xml:space="preserve">Interface (Leaflet) · Lógica (testável) · Dados (42 lugares)</w:t>
+        <w:t xml:space="preserve">Interface (Leaflet) · Lógica (testável) · Dados (65 lugares)</w:t>
       </w:r>
     </w:p>
     <w:p>
@@ -1484,7 +1484,7 @@
           <w:sz w:val="26"/>
           <w:szCs w:val="26"/>
         </w:rPr>
-        <w:t xml:space="preserve">Posições conferidas em 2 fontes</w:t>
+        <w:t xml:space="preserve">Posições conferidas no OpenStreetMap e na Wikipédia</w:t>
       </w:r>
     </w:p>
     <w:p>
@@ -1538,7 +1538,7 @@
           <w:sz w:val="26"/>
           <w:szCs w:val="26"/>
         </w:rPr>
-        <w:t xml:space="preserve">31 fotos livres · 28 testes automáticos</w:t>
+        <w:t xml:space="preserve">47 fotos livres · 28 testes automáticos</w:t>
       </w:r>
     </w:p>
     <w:p>
@@ -1750,7 +1750,7 @@
           <w:sz w:val="26"/>
           <w:szCs w:val="26"/>
         </w:rPr>
-        <w:t xml:space="preserve">11 lugares sem foto · testar em mais celulares</w:t>
+        <w:t xml:space="preserve">18 lugares sem foto · testar em mais celulares</w:t>
       </w:r>
     </w:p>
     <w:p>

</xml_diff>